<commit_message>
Mise à jour CV
</commit_message>
<xml_diff>
--- a/CV_FROMAGER.docx
+++ b/CV_FROMAGER.docx
@@ -520,7 +520,65 @@
                 <w:rFonts w:cs="Calibri"/>
                 <w:szCs w:val="22"/>
               </w:rPr>
-              <w:t xml:space="preserve"> AIA de DXC. Intégration Continue, sécurisation des données à l’aide de Docker, Jenkins et des outils DEVOPS. </w:t>
+              <w:t xml:space="preserve"> AIA de DXC</w:t>
+            </w:r>
+            <w:r>
+              <w:rPr>
+                <w:rFonts w:cs="Calibri"/>
+                <w:szCs w:val="22"/>
+              </w:rPr>
+              <w:t xml:space="preserve">, et des composants de la plateforme </w:t>
+            </w:r>
+            <w:proofErr w:type="spellStart"/>
+            <w:r>
+              <w:rPr>
+                <w:rFonts w:cs="Calibri"/>
+                <w:szCs w:val="22"/>
+              </w:rPr>
+              <w:t>d’Iot</w:t>
+            </w:r>
+            <w:proofErr w:type="spellEnd"/>
+            <w:r>
+              <w:rPr>
+                <w:rFonts w:cs="Calibri"/>
+                <w:szCs w:val="22"/>
+              </w:rPr>
+              <w:t xml:space="preserve"> DSP chez Schneider</w:t>
+            </w:r>
+            <w:r>
+              <w:rPr>
+                <w:rFonts w:cs="Calibri"/>
+                <w:szCs w:val="22"/>
+              </w:rPr>
+              <w:t>. Intégration Continue, sécurisation des données à l’aide de Docker, Jenkins</w:t>
+            </w:r>
+            <w:r>
+              <w:rPr>
+                <w:rFonts w:cs="Calibri"/>
+                <w:szCs w:val="22"/>
+              </w:rPr>
+              <w:t>, Azure DevOps</w:t>
+            </w:r>
+            <w:r>
+              <w:rPr>
+                <w:rFonts w:cs="Calibri"/>
+                <w:szCs w:val="22"/>
+              </w:rPr>
+              <w:t xml:space="preserve"> et des outils DEVOPS.</w:t>
+            </w:r>
+            <w:r>
+              <w:rPr>
+                <w:rFonts w:cs="Calibri"/>
+                <w:szCs w:val="22"/>
+              </w:rPr>
+              <w:t xml:space="preserve"> </w:t>
+            </w:r>
+            <w:r>
+              <w:rPr>
+                <w:rFonts w:cs="Calibri"/>
+                <w:szCs w:val="22"/>
+              </w:rPr>
+              <w:t xml:space="preserve"> </w:t>
             </w:r>
           </w:p>
           <w:p>
@@ -751,6 +809,8 @@
               <w:spacing w:after="0" w:line="240" w:lineRule="auto"/>
               <w:jc w:val="both"/>
             </w:pPr>
+            <w:proofErr w:type="spellStart"/>
+            <w:proofErr w:type="gramStart"/>
             <w:r>
               <w:rPr>
                 <w:b/>
@@ -758,47 +818,95 @@
                 <w:color w:val="4F81BD" w:themeColor="accent1"/>
                 <w:sz w:val="22"/>
                 <w:szCs w:val="22"/>
+                <w:lang w:val="en-US"/>
               </w:rPr>
               <w:t>Outils</w:t>
             </w:r>
+            <w:proofErr w:type="spellEnd"/>
             <w:r>
               <w:rPr>
                 <w:b/>
                 <w:smallCaps/>
                 <w:color w:val="4F81BD" w:themeColor="accent1"/>
                 <w:szCs w:val="22"/>
+                <w:lang w:val="en-US"/>
               </w:rPr>
               <w:t> :</w:t>
             </w:r>
-            <w:r>
-              <w:rPr>
-                <w:rFonts w:cs="Calibri"/>
-                <w:szCs w:val="22"/>
-              </w:rPr>
-              <w:t xml:space="preserve"> Conteneurs Docker</w:t>
-            </w:r>
-            <w:r>
-              <w:rPr>
-                <w:rFonts w:cs="Calibri"/>
-                <w:szCs w:val="22"/>
-              </w:rPr>
-              <w:t xml:space="preserve"> (docker-compose, docker </w:t>
+            <w:proofErr w:type="gramEnd"/>
+            <w:r>
+              <w:rPr>
+                <w:rFonts w:cs="Calibri"/>
+                <w:szCs w:val="22"/>
+                <w:lang w:val="en-US"/>
+              </w:rPr>
+              <w:t xml:space="preserve"> </w:t>
             </w:r>
             <w:proofErr w:type="spellStart"/>
             <w:r>
               <w:rPr>
                 <w:rFonts w:cs="Calibri"/>
                 <w:szCs w:val="22"/>
-              </w:rPr>
-              <w:t>swarm</w:t>
+                <w:lang w:val="en-US"/>
+              </w:rPr>
+              <w:t>Conteneurs</w:t>
             </w:r>
             <w:proofErr w:type="spellEnd"/>
             <w:r>
               <w:rPr>
                 <w:rFonts w:cs="Calibri"/>
                 <w:szCs w:val="22"/>
-              </w:rPr>
-              <w:t xml:space="preserve">, </w:t>
+                <w:lang w:val="en-US"/>
+              </w:rPr>
+              <w:t xml:space="preserve"> Docker</w:t>
+            </w:r>
+            <w:r>
+              <w:rPr>
+                <w:rFonts w:cs="Calibri"/>
+                <w:szCs w:val="22"/>
+                <w:lang w:val="en-US"/>
+              </w:rPr>
+              <w:t xml:space="preserve"> (docker-compose, docker swarm</w:t>
+            </w:r>
+            <w:r>
+              <w:rPr>
+                <w:rFonts w:cs="Calibri"/>
+                <w:szCs w:val="22"/>
+                <w:lang w:val="en-US"/>
+              </w:rPr>
+              <w:t>, Helm</w:t>
+            </w:r>
+            <w:r>
+              <w:rPr>
+                <w:rFonts w:cs="Calibri"/>
+                <w:szCs w:val="22"/>
+                <w:lang w:val="en-US"/>
+              </w:rPr>
+              <w:t xml:space="preserve">…) </w:t>
+            </w:r>
+            <w:r>
+              <w:rPr>
+                <w:rFonts w:cs="Calibri"/>
+                <w:szCs w:val="22"/>
+                <w:lang w:val="en-US"/>
+              </w:rPr>
+              <w:t xml:space="preserve"> </w:t>
+            </w:r>
+            <w:proofErr w:type="gramStart"/>
+            <w:r>
+              <w:rPr>
+                <w:rFonts w:cs="Calibri"/>
+                <w:szCs w:val="22"/>
+              </w:rPr>
+              <w:t>sous</w:t>
+            </w:r>
+            <w:proofErr w:type="gramEnd"/>
+            <w:r>
+              <w:rPr>
+                <w:rFonts w:cs="Calibri"/>
+                <w:szCs w:val="22"/>
+              </w:rPr>
+              <w:t xml:space="preserve"> Amazon ECS et Microsoft Azure AKS, VirtualBox, </w:t>
             </w:r>
             <w:proofErr w:type="spellStart"/>
             <w:r>
@@ -806,7 +914,7 @@
                 <w:rFonts w:cs="Calibri"/>
                 <w:szCs w:val="22"/>
               </w:rPr>
-              <w:t>Helm</w:t>
+              <w:t>Vagrant</w:t>
             </w:r>
             <w:proofErr w:type="spellEnd"/>
             <w:r>
@@ -814,14 +922,7 @@
                 <w:rFonts w:cs="Calibri"/>
                 <w:szCs w:val="22"/>
               </w:rPr>
-              <w:t xml:space="preserve">…) </w:t>
-            </w:r>
-            <w:r>
-              <w:rPr>
-                <w:rFonts w:cs="Calibri"/>
-                <w:szCs w:val="22"/>
-              </w:rPr>
-              <w:t xml:space="preserve"> sous Amazon ECS et Microsoft Azure AKS, VirtualBox, </w:t>
+              <w:t xml:space="preserve">, Ruby, Jenkins, </w:t>
             </w:r>
             <w:proofErr w:type="spellStart"/>
             <w:r>
@@ -829,7 +930,7 @@
                 <w:rFonts w:cs="Calibri"/>
                 <w:szCs w:val="22"/>
               </w:rPr>
-              <w:t>Vagrant</w:t>
+              <w:t>Cucumber</w:t>
             </w:r>
             <w:proofErr w:type="spellEnd"/>
             <w:r>
@@ -837,7 +938,14 @@
                 <w:rFonts w:cs="Calibri"/>
                 <w:szCs w:val="22"/>
               </w:rPr>
-              <w:t xml:space="preserve">, Ruby, Jenkins, </w:t>
+              <w:t>, Ansible,</w:t>
+            </w:r>
+            <w:r>
+              <w:rPr>
+                <w:rFonts w:cs="Calibri"/>
+                <w:szCs w:val="22"/>
+              </w:rPr>
+              <w:t xml:space="preserve"> </w:t>
             </w:r>
             <w:proofErr w:type="spellStart"/>
             <w:r>
@@ -845,7 +953,7 @@
                 <w:rFonts w:cs="Calibri"/>
                 <w:szCs w:val="22"/>
               </w:rPr>
-              <w:t>Cucumber</w:t>
+              <w:t>Terraform</w:t>
             </w:r>
             <w:proofErr w:type="spellEnd"/>
             <w:r>
@@ -853,7 +961,7 @@
                 <w:rFonts w:cs="Calibri"/>
                 <w:szCs w:val="22"/>
               </w:rPr>
-              <w:t>, Ansible,</w:t>
+              <w:t>,</w:t>
             </w:r>
             <w:r>
               <w:rPr>
@@ -868,7 +976,7 @@
                 <w:rFonts w:cs="Calibri"/>
                 <w:szCs w:val="22"/>
               </w:rPr>
-              <w:t>Terraform</w:t>
+              <w:t>Kubernetes</w:t>
             </w:r>
             <w:proofErr w:type="spellEnd"/>
             <w:r>
@@ -876,24 +984,8 @@
                 <w:rFonts w:cs="Calibri"/>
                 <w:szCs w:val="22"/>
               </w:rPr>
-              <w:t>,</w:t>
-            </w:r>
-            <w:r>
-              <w:rPr>
-                <w:rFonts w:cs="Calibri"/>
-                <w:szCs w:val="22"/>
-              </w:rPr>
-              <w:t xml:space="preserve"> </w:t>
-            </w:r>
-            <w:proofErr w:type="spellStart"/>
-            <w:r>
-              <w:rPr>
-                <w:rFonts w:cs="Calibri"/>
-                <w:szCs w:val="22"/>
-              </w:rPr>
-              <w:t>Kubernetes</w:t>
-            </w:r>
-            <w:proofErr w:type="spellEnd"/>
+              <w:t xml:space="preserve"> (AKS)</w:t>
+            </w:r>
             <w:r>
               <w:rPr>
                 <w:rFonts w:cs="Calibri"/>
@@ -901,15 +993,13 @@
               </w:rPr>
               <w:t xml:space="preserve">. </w:t>
             </w:r>
-            <w:proofErr w:type="spellStart"/>
-            <w:r>
-              <w:rPr>
-                <w:rFonts w:cs="Calibri"/>
-                <w:szCs w:val="22"/>
-              </w:rPr>
-              <w:t>GlusterFS</w:t>
-            </w:r>
-            <w:proofErr w:type="spellEnd"/>
+            <w:r>
+              <w:rPr>
+                <w:rFonts w:cs="Calibri"/>
+                <w:szCs w:val="22"/>
+              </w:rPr>
+              <w:t>Azure DevOps</w:t>
+            </w:r>
           </w:p>
         </w:tc>
       </w:tr>
@@ -1130,10 +1220,8 @@
               <w:jc w:val="both"/>
               <w:rPr>
                 <w:rStyle w:val="Titre1Car"/>
-                <w:rFonts w:asciiTheme="minorHAnsi" w:hAnsiTheme="minorHAnsi"/>
                 <w:caps/>
                 <w:color w:val="00000A"/>
-                <w:sz w:val="20"/>
               </w:rPr>
             </w:pPr>
             <w:r>
@@ -1144,9 +1232,33 @@
                 <w:color w:val="00000A"/>
                 <w:sz w:val="20"/>
               </w:rPr>
-              <w:t xml:space="preserve">HARDIS GROUP </w:t>
-            </w:r>
-            <w:r>
+              <w:t>S</w:t>
+            </w:r>
+            <w:r>
+              <w:rPr>
+                <w:rStyle w:val="Titre1Car"/>
+                <w:caps/>
+                <w:color w:val="00000A"/>
+              </w:rPr>
+              <w:t xml:space="preserve">CHNEIDER POUR CONAN JEKEN CONSULTING DEPUIS AVRIL 2019 </w:t>
+            </w:r>
+          </w:p>
+          <w:p>
+            <w:r>
+              <w:t>Poste occupé : Cons</w:t>
+            </w:r>
+            <w:bookmarkStart w:id="0" w:name="_GoBack"/>
+            <w:bookmarkEnd w:id="0"/>
+            <w:r>
+              <w:t>ultant, Ingénieur DevOps</w:t>
+            </w:r>
+          </w:p>
+          <w:p/>
+          <w:p>
+            <w:pPr>
+              <w:pStyle w:val="Titre2"/>
+              <w:spacing w:line="240" w:lineRule="auto"/>
+              <w:jc w:val="both"/>
               <w:rPr>
                 <w:rStyle w:val="Titre1Car"/>
                 <w:rFonts w:asciiTheme="minorHAnsi" w:hAnsiTheme="minorHAnsi"/>
@@ -1154,16 +1266,7 @@
                 <w:color w:val="00000A"/>
                 <w:sz w:val="20"/>
               </w:rPr>
-              <w:t>D</w:t>
-            </w:r>
-            <w:r>
-              <w:rPr>
-                <w:rStyle w:val="Titre1Car"/>
-                <w:caps/>
-                <w:color w:val="00000A"/>
-              </w:rPr>
-              <w:t>E</w:t>
-            </w:r>
+            </w:pPr>
             <w:r>
               <w:rPr>
                 <w:rStyle w:val="Titre1Car"/>
@@ -1172,7 +1275,7 @@
                 <w:color w:val="00000A"/>
                 <w:sz w:val="20"/>
               </w:rPr>
-              <w:t xml:space="preserve"> </w:t>
+              <w:t xml:space="preserve">HARDIS GROUP </w:t>
             </w:r>
             <w:r>
               <w:rPr>
@@ -1182,7 +1285,7 @@
                 <w:color w:val="00000A"/>
                 <w:sz w:val="20"/>
               </w:rPr>
-              <w:t>A</w:t>
+              <w:t>D</w:t>
             </w:r>
             <w:r>
               <w:rPr>
@@ -1190,10 +1293,36 @@
                 <w:caps/>
                 <w:color w:val="00000A"/>
               </w:rPr>
+              <w:t>E</w:t>
+            </w:r>
+            <w:r>
+              <w:rPr>
+                <w:rStyle w:val="Titre1Car"/>
+                <w:rFonts w:asciiTheme="minorHAnsi" w:hAnsiTheme="minorHAnsi"/>
+                <w:caps/>
+                <w:color w:val="00000A"/>
+                <w:sz w:val="20"/>
+              </w:rPr>
+              <w:t xml:space="preserve"> </w:t>
+            </w:r>
+            <w:r>
+              <w:rPr>
+                <w:rStyle w:val="Titre1Car"/>
+                <w:rFonts w:asciiTheme="minorHAnsi" w:hAnsiTheme="minorHAnsi"/>
+                <w:caps/>
+                <w:color w:val="00000A"/>
+                <w:sz w:val="20"/>
+              </w:rPr>
+              <w:t>A</w:t>
+            </w:r>
+            <w:r>
+              <w:rPr>
+                <w:rStyle w:val="Titre1Car"/>
+                <w:caps/>
+                <w:color w:val="00000A"/>
+              </w:rPr>
               <w:t>VRIL</w:t>
             </w:r>
-            <w:bookmarkStart w:id="0" w:name="_GoBack"/>
-            <w:bookmarkEnd w:id="0"/>
             <w:r>
               <w:rPr>
                 <w:rStyle w:val="Titre1Car"/>
@@ -1571,7 +1700,6 @@
                 <w:i/>
                 <w:color w:val="0070C0"/>
               </w:rPr>
-              <w:lastRenderedPageBreak/>
               <w:t xml:space="preserve">INTEGRATION CONTINUE </w:t>
             </w:r>
             <w:r>
@@ -2288,7 +2416,6 @@
                 <w:rFonts w:asciiTheme="minorHAnsi" w:hAnsiTheme="minorHAnsi"/>
                 <w:sz w:val="18"/>
               </w:rPr>
-              <w:lastRenderedPageBreak/>
               <w:t>FORMATION</w:t>
             </w:r>
           </w:p>
@@ -5436,18 +5563,18 @@
 </file>
 
 <file path=customXml/item2.xml><?xml version="1.0" encoding="utf-8"?>
+<mappings xmlns="http://schemas.microsoft.com/pics">
+  <picture>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</picture>
+</mappings>
+</file>
+
+<file path=customXml/item3.xml><?xml version="1.0" encoding="utf-8"?>
 <?mso-contentType ?>
 <FormTemplates xmlns="http://schemas.microsoft.com/sharepoint/v3/contenttype/forms">
   <Display>DocumentLibraryForm</Display>
   <Edit>AssetEditForm</Edit>
   <New>DocumentLibraryForm</New>
 </FormTemplates>
-</file>
-
-<file path=customXml/item3.xml><?xml version="1.0" encoding="utf-8"?>
-<mappings xmlns="http://schemas.microsoft.com/pics">
-  <picture>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</picture>
-</mappings>
 </file>
 
 <file path=customXml/itemProps1.xml><?xml version="1.0" encoding="utf-8"?>
@@ -5459,17 +5586,17 @@
 </file>
 
 <file path=customXml/itemProps2.xml><?xml version="1.0" encoding="utf-8"?>
+<ds:datastoreItem xmlns:ds="http://schemas.openxmlformats.org/officeDocument/2006/customXml" ds:itemID="{E437E9E5-EE29-454F-8714-516920628209}">
+  <ds:schemaRefs>
+    <ds:schemaRef ds:uri="http://schemas.microsoft.com/pics"/>
+  </ds:schemaRefs>
+</ds:datastoreItem>
+</file>
+
+<file path=customXml/itemProps3.xml><?xml version="1.0" encoding="utf-8"?>
 <ds:datastoreItem xmlns:ds="http://schemas.openxmlformats.org/officeDocument/2006/customXml" ds:itemID="{F0EDECC0-4E27-4FC9-BA6F-6D753F7105A3}">
   <ds:schemaRefs>
     <ds:schemaRef ds:uri="http://schemas.microsoft.com/sharepoint/v3/contenttype/forms"/>
   </ds:schemaRefs>
 </ds:datastoreItem>
-</file>
-
-<file path=customXml/itemProps3.xml><?xml version="1.0" encoding="utf-8"?>
-<ds:datastoreItem xmlns:ds="http://schemas.openxmlformats.org/officeDocument/2006/customXml" ds:itemID="{E437E9E5-EE29-454F-8714-516920628209}">
-  <ds:schemaRefs>
-    <ds:schemaRef ds:uri="http://schemas.microsoft.com/pics"/>
-  </ds:schemaRefs>
-</ds:datastoreItem>
 </file>
</xml_diff>

<commit_message>
modif pour Christian le 6 janvier 2021
</commit_message>
<xml_diff>
--- a/CV_FROMAGER.docx
+++ b/CV_FROMAGER.docx
@@ -304,7 +304,7 @@
                 <w:color w:val="595959" w:themeColor="text1" w:themeTint="A6"/>
                 <w:lang w:eastAsia="fr-FR"/>
               </w:rPr>
-              <w:t>Conduite de projets R&amp;D</w:t>
+              <w:t>Terraform, Azure DevOps</w:t>
             </w:r>
             <w:r>
               <w:rPr>
@@ -314,7 +314,7 @@
                 <w:color w:val="595959" w:themeColor="text1" w:themeTint="A6"/>
                 <w:lang w:eastAsia="fr-FR"/>
               </w:rPr>
-              <w:t>, DevOps</w:t>
+              <w:t>, CI/</w:t>
             </w:r>
             <w:r>
               <w:rPr>
@@ -324,7 +324,7 @@
                 <w:color w:val="595959" w:themeColor="text1" w:themeTint="A6"/>
                 <w:lang w:eastAsia="fr-FR"/>
               </w:rPr>
-              <w:t>, Anglais courant</w:t>
+              <w:t>CD</w:t>
             </w:r>
           </w:p>
         </w:tc>
@@ -849,21 +849,12 @@
               </w:rPr>
               <w:t xml:space="preserve"> </w:t>
             </w:r>
-            <w:proofErr w:type="gramStart"/>
-            <w:r>
-              <w:rPr>
-                <w:rFonts w:cs="Calibri"/>
-                <w:szCs w:val="22"/>
-              </w:rPr>
-              <w:t>sous</w:t>
-            </w:r>
-            <w:proofErr w:type="gramEnd"/>
-            <w:r>
-              <w:rPr>
-                <w:rFonts w:cs="Calibri"/>
-                <w:szCs w:val="22"/>
-              </w:rPr>
-              <w:t xml:space="preserve"> Amazon </w:t>
+            <w:r>
+              <w:rPr>
+                <w:rFonts w:cs="Calibri"/>
+                <w:szCs w:val="22"/>
+              </w:rPr>
+              <w:t xml:space="preserve">sous Amazon </w:t>
             </w:r>
             <w:r>
               <w:rPr>
@@ -1362,7 +1353,7 @@
                   <w14:round/>
                 </w14:textOutline>
               </w:rPr>
-              <w:t>novembre</w:t>
+              <w:t>décembre</w:t>
             </w:r>
             <w:r>
               <w:rPr>
@@ -1403,14 +1394,14 @@
                 <w:b/>
                 <w:bCs/>
               </w:rPr>
-              <w:t>Consultant auprès de plusieurs clients</w:t>
+              <w:t>Veille technologique</w:t>
             </w:r>
             <w:r>
               <w:rPr>
                 <w:b/>
                 <w:bCs/>
               </w:rPr>
-              <w:t xml:space="preserve"> </w:t>
+              <w:t xml:space="preserve"> autour du DevOps et du développement</w:t>
             </w:r>
           </w:p>
           <w:p>
@@ -1432,43 +1423,7 @@
                 <w:b/>
                 <w:bCs/>
               </w:rPr>
-              <w:t>Veille technologique</w:t>
-            </w:r>
-            <w:r>
-              <w:rPr>
-                <w:b/>
-                <w:bCs/>
-              </w:rPr>
-              <w:t xml:space="preserve"> autour du DevOps et du développement</w:t>
-            </w:r>
-          </w:p>
-          <w:p>
-            <w:pPr>
-              <w:pStyle w:val="Paragraphedeliste"/>
-              <w:numPr>
-                <w:ilvl w:val="0"/>
-                <w:numId w:val="4"/>
-              </w:numPr>
-              <w:spacing w:before="0" w:after="0" w:line="240" w:lineRule="auto"/>
-              <w:jc w:val="both"/>
-              <w:rPr>
-                <w:b/>
-                <w:bCs/>
-              </w:rPr>
-            </w:pPr>
-            <w:r>
-              <w:rPr>
-                <w:b/>
-                <w:bCs/>
-              </w:rPr>
-              <w:t>Renforcement de mes connaissances dans le langage Python, et le framework Djang</w:t>
-            </w:r>
-            <w:r>
-              <w:rPr>
-                <w:b/>
-                <w:bCs/>
-              </w:rPr>
-              <w:t>o</w:t>
+              <w:t>Renforcement de mes connaissances dans le langage Python, et le framework Django</w:t>
             </w:r>
             <w:r>
               <w:rPr>
@@ -1723,7 +1678,21 @@
                 <w:b/>
                 <w:bCs/>
               </w:rPr>
-              <w:t xml:space="preserve"> dans l’environnement de production (pipelines)</w:t>
+              <w:t xml:space="preserve"> dans l’environnement de production (pipelines</w:t>
+            </w:r>
+            <w:r>
+              <w:rPr>
+                <w:b/>
+                <w:bCs/>
+              </w:rPr>
+              <w:t>, Terraform</w:t>
+            </w:r>
+            <w:r>
+              <w:rPr>
+                <w:b/>
+                <w:bCs/>
+              </w:rPr>
+              <w:t>)</w:t>
             </w:r>
           </w:p>
           <w:p>
@@ -3968,6 +3937,7 @@
     <w:lsdException w:name="HTML Sample" w:semiHidden="1" w:unhideWhenUsed="1"/>
     <w:lsdException w:name="HTML Typewriter" w:semiHidden="1" w:unhideWhenUsed="1"/>
     <w:lsdException w:name="HTML Variable" w:semiHidden="1" w:unhideWhenUsed="1"/>
+    <w:lsdException w:name="Normal Table" w:semiHidden="1" w:unhideWhenUsed="1"/>
     <w:lsdException w:name="annotation subject" w:semiHidden="1" w:unhideWhenUsed="1"/>
     <w:lsdException w:name="No List" w:semiHidden="1" w:unhideWhenUsed="1"/>
     <w:lsdException w:name="Outline List 1" w:semiHidden="1" w:unhideWhenUsed="1"/>
@@ -4010,8 +3980,11 @@
     <w:lsdException w:name="Table Contemporary" w:semiHidden="1" w:unhideWhenUsed="1"/>
     <w:lsdException w:name="Table Elegant" w:semiHidden="1" w:unhideWhenUsed="1"/>
     <w:lsdException w:name="Table Professional" w:semiHidden="1" w:unhideWhenUsed="1"/>
+    <w:lsdException w:name="Table Subtle 1" w:semiHidden="1" w:unhideWhenUsed="1"/>
     <w:lsdException w:name="Table Subtle 2" w:semiHidden="1" w:unhideWhenUsed="1"/>
     <w:lsdException w:name="Table Web 1" w:semiHidden="1" w:unhideWhenUsed="1"/>
+    <w:lsdException w:name="Table Web 2" w:semiHidden="1" w:unhideWhenUsed="1"/>
+    <w:lsdException w:name="Table Web 3" w:semiHidden="1" w:unhideWhenUsed="1"/>
     <w:lsdException w:name="Balloon Text" w:semiHidden="1" w:unhideWhenUsed="1"/>
     <w:lsdException w:name="Table Grid" w:uiPriority="59"/>
     <w:lsdException w:name="Table Theme" w:semiHidden="1" w:unhideWhenUsed="1"/>

</xml_diff>

<commit_message>
update Jenkins pour CJ le 10/02/21
</commit_message>
<xml_diff>
--- a/CV_FROMAGER.docx
+++ b/CV_FROMAGER.docx
@@ -160,11 +160,19 @@
                 <w:rFonts w:ascii="Calibri" w:hAnsi="Calibri" w:cs="Calibri"/>
               </w:rPr>
             </w:pPr>
+            <w:proofErr w:type="gramStart"/>
             <w:r>
               <w:rPr>
                 <w:sz w:val="20"/>
               </w:rPr>
-              <w:t>Email : fred.fromager@gmail.com</w:t>
+              <w:t>Email</w:t>
+            </w:r>
+            <w:proofErr w:type="gramEnd"/>
+            <w:r>
+              <w:rPr>
+                <w:sz w:val="20"/>
+              </w:rPr>
+              <w:t> : fred.fromager@gmail.com</w:t>
             </w:r>
           </w:p>
           <w:p>
@@ -849,12 +857,21 @@
               </w:rPr>
               <w:t xml:space="preserve"> </w:t>
             </w:r>
-            <w:r>
-              <w:rPr>
-                <w:rFonts w:cs="Calibri"/>
-                <w:szCs w:val="22"/>
-              </w:rPr>
-              <w:t xml:space="preserve">sous Amazon </w:t>
+            <w:proofErr w:type="gramStart"/>
+            <w:r>
+              <w:rPr>
+                <w:rFonts w:cs="Calibri"/>
+                <w:szCs w:val="22"/>
+              </w:rPr>
+              <w:t>sous</w:t>
+            </w:r>
+            <w:proofErr w:type="gramEnd"/>
+            <w:r>
+              <w:rPr>
+                <w:rFonts w:cs="Calibri"/>
+                <w:szCs w:val="22"/>
+              </w:rPr>
+              <w:t xml:space="preserve"> Amazon </w:t>
             </w:r>
             <w:r>
               <w:rPr>
@@ -2223,10 +2240,7 @@
               <w:rPr>
                 <w:rFonts w:cs="Calibri"/>
               </w:rPr>
-              <w:t xml:space="preserve">Transformation de l’application GRAPHTALK et de son environnement en conteneurs Docker, </w:t>
-            </w:r>
-            <w:r>
-              <w:t>Installation sous ECS de l’application GRAPHTALK AIA avec création de conteneurs pour les différents modules du logiciel.</w:t>
+              <w:t>Transformation de l’application GRAPHTALK en conteneurs Docker</w:t>
             </w:r>
           </w:p>
           <w:p>
@@ -2246,6 +2260,7 @@
               <w:jc w:val="both"/>
               <w:rPr>
                 <w:rFonts w:cs="Calibri"/>
+                <w:i/>
                 <w:color w:val="00000A"/>
               </w:rPr>
             </w:pPr>
@@ -2256,31 +2271,13 @@
                 <w:i/>
                 <w:color w:val="0070C0"/>
               </w:rPr>
-              <w:t xml:space="preserve">INTEGRATION CONTINUE </w:t>
-            </w:r>
-            <w:r>
-              <w:rPr>
-                <w:rFonts w:cs="Calibri"/>
-                <w:color w:val="auto"/>
-              </w:rPr>
-              <w:t xml:space="preserve">Automatisation </w:t>
-            </w:r>
-            <w:r>
-              <w:rPr>
-                <w:rFonts w:cs="Calibri"/>
-                <w:color w:val="00000A"/>
-              </w:rPr>
-              <w:t>de la livraison du logiciel GRAPHTALK AIA</w:t>
+              <w:t xml:space="preserve">DEVOPS SUR GRAPHTALK AIA </w:t>
             </w:r>
           </w:p>
           <w:p>
             <w:pPr>
               <w:pStyle w:val="Paragraphedeliste"/>
               <w:widowControl w:val="0"/>
-              <w:numPr>
-                <w:ilvl w:val="0"/>
-                <w:numId w:val="2"/>
-              </w:numPr>
               <w:tabs>
                 <w:tab w:val="left" w:pos="510"/>
               </w:tabs>
@@ -2290,8 +2287,6 @@
               <w:jc w:val="both"/>
               <w:rPr>
                 <w:rFonts w:cs="Calibri"/>
-                <w:i/>
-                <w:color w:val="00000A"/>
               </w:rPr>
             </w:pPr>
             <w:r>
@@ -2301,13 +2296,252 @@
                 <w:i/>
                 <w:color w:val="0070C0"/>
               </w:rPr>
-              <w:t xml:space="preserve">DEVOPS SUR GRAPHTALK AIA </w:t>
-            </w:r>
-            <w:r>
-              <w:rPr>
-                <w:rFonts w:cs="Calibri"/>
-              </w:rPr>
-              <w:t>Développement d’une chaine d’intégration continue sous Jenkins. Création d’une chaîne de validation continue du logiciel GRAPHTALK AIA avec tests et lancement d’alertes.</w:t>
+              <w:t xml:space="preserve">- </w:t>
+            </w:r>
+            <w:r>
+              <w:rPr>
+                <w:rFonts w:cs="Calibri"/>
+              </w:rPr>
+              <w:t>Jenkins</w:t>
+            </w:r>
+            <w:r>
+              <w:rPr>
+                <w:rFonts w:cs="Calibri"/>
+              </w:rPr>
+              <w:t xml:space="preserve"> : </w:t>
+            </w:r>
+            <w:r>
+              <w:rPr>
+                <w:rFonts w:cs="Calibri"/>
+              </w:rPr>
+              <w:t xml:space="preserve"> Création d’une chaîne </w:t>
+            </w:r>
+            <w:r>
+              <w:rPr>
+                <w:rFonts w:cs="Calibri"/>
+              </w:rPr>
+              <w:t xml:space="preserve">d’intégration </w:t>
+            </w:r>
+            <w:r>
+              <w:rPr>
+                <w:rFonts w:cs="Calibri"/>
+              </w:rPr>
+              <w:t>continue du logiciel GRAPHTALK AIA</w:t>
+            </w:r>
+            <w:r>
+              <w:rPr>
+                <w:rFonts w:cs="Calibri"/>
+              </w:rPr>
+              <w:t>.</w:t>
+            </w:r>
+            <w:r>
+              <w:rPr>
+                <w:rFonts w:cs="Calibri"/>
+              </w:rPr>
+              <w:t xml:space="preserve"> </w:t>
+            </w:r>
+            <w:r>
+              <w:rPr>
+                <w:rFonts w:cs="Calibri"/>
+              </w:rPr>
+              <w:t>Un fichier JenkinsFile était stocké sur github</w:t>
+            </w:r>
+            <w:r>
+              <w:rPr>
+                <w:rFonts w:cs="Calibri"/>
+              </w:rPr>
+              <w:t xml:space="preserve"> avec les sources GRAPHTALK</w:t>
+            </w:r>
+            <w:r>
+              <w:rPr>
+                <w:rFonts w:cs="Calibri"/>
+              </w:rPr>
+              <w:t xml:space="preserve">. Le code Groovy permettait </w:t>
+            </w:r>
+            <w:r>
+              <w:rPr>
+                <w:rFonts w:cs="Calibri"/>
+              </w:rPr>
+              <w:t>de dérouler</w:t>
+            </w:r>
+            <w:r>
+              <w:rPr>
+                <w:rFonts w:cs="Calibri"/>
+              </w:rPr>
+              <w:t xml:space="preserve"> le pipeline</w:t>
+            </w:r>
+            <w:r>
+              <w:rPr>
+                <w:rFonts w:cs="Calibri"/>
+              </w:rPr>
+              <w:t xml:space="preserve"> Jenkins</w:t>
+            </w:r>
+            <w:r>
+              <w:rPr>
+                <w:rFonts w:cs="Calibri"/>
+              </w:rPr>
+              <w:t xml:space="preserve"> suivant : </w:t>
+            </w:r>
+            <w:r>
+              <w:rPr>
+                <w:rFonts w:cs="Calibri"/>
+              </w:rPr>
+              <w:t xml:space="preserve">clone du code </w:t>
+            </w:r>
+            <w:r>
+              <w:rPr>
+                <w:rFonts w:cs="Calibri"/>
+              </w:rPr>
+              <w:t xml:space="preserve">stocké </w:t>
+            </w:r>
+            <w:r>
+              <w:rPr>
+                <w:rFonts w:cs="Calibri"/>
+              </w:rPr>
+              <w:t xml:space="preserve">sur github puis </w:t>
+            </w:r>
+            <w:r>
+              <w:rPr>
+                <w:rFonts w:cs="Calibri"/>
+              </w:rPr>
+              <w:t xml:space="preserve">build sur les machines </w:t>
+            </w:r>
+            <w:r>
+              <w:rPr>
+                <w:rFonts w:cs="Calibri"/>
+              </w:rPr>
+              <w:t xml:space="preserve">Amazon </w:t>
+            </w:r>
+            <w:r>
+              <w:rPr>
+                <w:rFonts w:cs="Calibri"/>
+              </w:rPr>
+              <w:t>EC2</w:t>
+            </w:r>
+            <w:r>
+              <w:rPr>
+                <w:rFonts w:cs="Calibri"/>
+              </w:rPr>
+              <w:t xml:space="preserve">, packaging et stockage </w:t>
+            </w:r>
+            <w:r>
+              <w:rPr>
+                <w:rFonts w:cs="Calibri"/>
+              </w:rPr>
+              <w:t xml:space="preserve">du résultat </w:t>
+            </w:r>
+            <w:r>
+              <w:rPr>
+                <w:rFonts w:cs="Calibri"/>
+              </w:rPr>
+              <w:t xml:space="preserve">sur Amazon S3, déploiement et run </w:t>
+            </w:r>
+            <w:r>
+              <w:rPr>
+                <w:rFonts w:cs="Calibri"/>
+              </w:rPr>
+              <w:t>des tests automatiques</w:t>
+            </w:r>
+            <w:r>
+              <w:rPr>
+                <w:rFonts w:cs="Calibri"/>
+              </w:rPr>
+              <w:t xml:space="preserve"> </w:t>
+            </w:r>
+            <w:r>
+              <w:rPr>
+                <w:rFonts w:cs="Calibri"/>
+              </w:rPr>
+              <w:t xml:space="preserve">Cucumber </w:t>
+            </w:r>
+            <w:r>
+              <w:rPr>
+                <w:rFonts w:cs="Calibri"/>
+              </w:rPr>
+              <w:t>sur des machines EC2</w:t>
+            </w:r>
+            <w:r>
+              <w:rPr>
+                <w:rFonts w:cs="Calibri"/>
+              </w:rPr>
+              <w:t xml:space="preserve">, </w:t>
+            </w:r>
+            <w:r>
+              <w:rPr>
+                <w:rFonts w:cs="Calibri"/>
+              </w:rPr>
+              <w:t>e</w:t>
+            </w:r>
+            <w:r>
+              <w:rPr>
+                <w:rFonts w:cs="Calibri"/>
+              </w:rPr>
+              <w:t>nvoie des résultats par mail.</w:t>
+            </w:r>
+            <w:r>
+              <w:rPr>
+                <w:rFonts w:cs="Calibri"/>
+              </w:rPr>
+              <w:t xml:space="preserve"> </w:t>
+            </w:r>
+          </w:p>
+          <w:p>
+            <w:pPr>
+              <w:pStyle w:val="Paragraphedeliste"/>
+              <w:widowControl w:val="0"/>
+              <w:tabs>
+                <w:tab w:val="left" w:pos="510"/>
+              </w:tabs>
+              <w:suppressAutoHyphens/>
+              <w:spacing w:before="0" w:after="0" w:line="240" w:lineRule="auto"/>
+              <w:ind w:left="680"/>
+              <w:jc w:val="both"/>
+              <w:rPr>
+                <w:rFonts w:cs="Calibri"/>
+              </w:rPr>
+            </w:pPr>
+          </w:p>
+          <w:p>
+            <w:pPr>
+              <w:pStyle w:val="Paragraphedeliste"/>
+              <w:widowControl w:val="0"/>
+              <w:tabs>
+                <w:tab w:val="left" w:pos="510"/>
+              </w:tabs>
+              <w:suppressAutoHyphens/>
+              <w:spacing w:before="0" w:after="0" w:line="240" w:lineRule="auto"/>
+              <w:ind w:left="680"/>
+              <w:jc w:val="both"/>
+              <w:rPr>
+                <w:rFonts w:cs="Calibri"/>
+                <w:iCs/>
+                <w:color w:val="00000A"/>
+              </w:rPr>
+            </w:pPr>
+            <w:r>
+              <w:rPr>
+                <w:rFonts w:cs="Calibri"/>
+                <w:b/>
+                <w:iCs/>
+                <w:color w:val="0070C0"/>
+              </w:rPr>
+              <w:t>-</w:t>
+            </w:r>
+            <w:r>
+              <w:rPr>
+                <w:rFonts w:cs="Calibri"/>
+                <w:iCs/>
+                <w:color w:val="00000A"/>
+              </w:rPr>
+              <w:t xml:space="preserve"> Ansible :</w:t>
+            </w:r>
+            <w:r>
+              <w:rPr>
+                <w:rFonts w:cs="Calibri"/>
+                <w:iCs/>
+                <w:color w:val="00000A"/>
+              </w:rPr>
+              <w:t xml:space="preserve"> Création de playbooks pour automatiser les builds et déploiement sur AWS. Le but était de builder, déployer et tester sur AWS EC2 en ligne de commande ou par script en dehors de Jenkins. </w:t>
             </w:r>
           </w:p>
           <w:p>
@@ -3193,6 +3427,7 @@
                 <w:rFonts w:asciiTheme="minorHAnsi" w:hAnsiTheme="minorHAnsi"/>
                 <w:sz w:val="16"/>
               </w:rPr>
+              <w:lastRenderedPageBreak/>
               <w:t>DIVERS</w:t>
             </w:r>
           </w:p>
@@ -6124,18 +6359,18 @@
 </file>
 
 <file path=customXml/item2.xml><?xml version="1.0" encoding="utf-8"?>
+<mappings xmlns="http://schemas.microsoft.com/pics">
+  <picture>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</picture>
+</mappings>
+</file>
+
+<file path=customXml/item3.xml><?xml version="1.0" encoding="utf-8"?>
 <?mso-contentType ?>
 <FormTemplates xmlns="http://schemas.microsoft.com/sharepoint/v3/contenttype/forms">
   <Display>DocumentLibraryForm</Display>
   <Edit>AssetEditForm</Edit>
   <New>DocumentLibraryForm</New>
 </FormTemplates>
-</file>
-
-<file path=customXml/item3.xml><?xml version="1.0" encoding="utf-8"?>
-<mappings xmlns="http://schemas.microsoft.com/pics">
-  <picture>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</picture>
-</mappings>
 </file>
 
 <file path=customXml/itemProps1.xml><?xml version="1.0" encoding="utf-8"?>
@@ -6147,17 +6382,17 @@
 </file>
 
 <file path=customXml/itemProps2.xml><?xml version="1.0" encoding="utf-8"?>
+<ds:datastoreItem xmlns:ds="http://schemas.openxmlformats.org/officeDocument/2006/customXml" ds:itemID="{E437E9E5-EE29-454F-8714-516920628209}">
+  <ds:schemaRefs>
+    <ds:schemaRef ds:uri="http://schemas.microsoft.com/pics"/>
+  </ds:schemaRefs>
+</ds:datastoreItem>
+</file>
+
+<file path=customXml/itemProps3.xml><?xml version="1.0" encoding="utf-8"?>
 <ds:datastoreItem xmlns:ds="http://schemas.openxmlformats.org/officeDocument/2006/customXml" ds:itemID="{F0EDECC0-4E27-4FC9-BA6F-6D753F7105A3}">
   <ds:schemaRefs>
     <ds:schemaRef ds:uri="http://schemas.microsoft.com/sharepoint/v3/contenttype/forms"/>
   </ds:schemaRefs>
 </ds:datastoreItem>
-</file>
-
-<file path=customXml/itemProps3.xml><?xml version="1.0" encoding="utf-8"?>
-<ds:datastoreItem xmlns:ds="http://schemas.openxmlformats.org/officeDocument/2006/customXml" ds:itemID="{E437E9E5-EE29-454F-8714-516920628209}">
-  <ds:schemaRefs>
-    <ds:schemaRef ds:uri="http://schemas.microsoft.com/pics"/>
-  </ds:schemaRefs>
-</ds:datastoreItem>
 </file>
</xml_diff>